<commit_message>
agregue un detalle al informe
</commit_message>
<xml_diff>
--- a/documentos/INFORME/Informe_PDD.docx
+++ b/documentos/INFORME/Informe_PDD.docx
@@ -1497,7 +1497,23 @@
     </w:p>
     <w:p>
       <w:r>
-        <w:t>Este diagrama de casos de uso, nos dice que los actores “Cliente” y “Recepcionista” son los que interactúan con ciertos requerimientos específicos, de forma que con este esquema, se puede entender como funciona el sistema en su totalidad.</w:t>
+        <w:t xml:space="preserve">Este diagrama de casos de </w:t>
+      </w:r>
+      <w:proofErr w:type="gramStart"/>
+      <w:r>
+        <w:t>uso,</w:t>
+      </w:r>
+      <w:proofErr w:type="gramEnd"/>
+      <w:r>
+        <w:t xml:space="preserve"> nos dice que los actores “Cliente” y “Recepcionista” son los que interactúan con ciertos requerimientos específicos, de forma </w:t>
+      </w:r>
+      <w:proofErr w:type="gramStart"/>
+      <w:r>
+        <w:t>que</w:t>
+      </w:r>
+      <w:proofErr w:type="gramEnd"/>
+      <w:r>
+        <w:t xml:space="preserve"> con este esquema, se puede entender como funciona el sistema en su totalidad.</w:t>
       </w:r>
     </w:p>
     <w:p>
@@ -1524,7 +1540,15 @@
         <w:pStyle w:val="Subttulo"/>
       </w:pPr>
       <w:r>
-        <w:t>(Con zoom se ve bien)</w:t>
+        <w:t xml:space="preserve">(Con </w:t>
+      </w:r>
+      <w:proofErr w:type="gramStart"/>
+      <w:r>
+        <w:t>zoom</w:t>
+      </w:r>
+      <w:proofErr w:type="gramEnd"/>
+      <w:r>
+        <w:t xml:space="preserve"> se ve bien)</w:t>
       </w:r>
     </w:p>
     <w:p>
@@ -1881,7 +1905,15 @@
         <w:t>Camino “No”:</w:t>
       </w:r>
       <w:r>
-        <w:t xml:space="preserve"> Fue con anticipación por lo cual puede cancelar su reserva, esto avisa a la recepcionista que actualice su vista puesto el huésped será removido, y se termina con el cliente teniendo su reserva anulada.</w:t>
+        <w:t xml:space="preserve"> Fue con anticipación por lo cual puede cancelar su reserva, esto avisa a la recepcionista que actualice su </w:t>
+      </w:r>
+      <w:proofErr w:type="gramStart"/>
+      <w:r>
+        <w:t>vista puesto</w:t>
+      </w:r>
+      <w:proofErr w:type="gramEnd"/>
+      <w:r>
+        <w:t xml:space="preserve"> el huésped será removido, y se termina con el cliente teniendo su reserva anulada.</w:t>
       </w:r>
     </w:p>
     <w:p/>
@@ -2047,12 +2079,17 @@
         <w:t xml:space="preserve">, Este patrón proporciona un método simplificado (ej. </w:t>
       </w:r>
       <w:proofErr w:type="spellStart"/>
+      <w:proofErr w:type="gramStart"/>
       <w:r>
         <w:t>reservarHabitacion</w:t>
       </w:r>
       <w:proofErr w:type="spellEnd"/>
       <w:r>
-        <w:t>()) que orquesta todos estos subsistemas por detrás, desacoplando la vista de la lógica de negocio profunda y mejorando la usabilidad del sistema.</w:t>
+        <w:t>(</w:t>
+      </w:r>
+      <w:proofErr w:type="gramEnd"/>
+      <w:r>
+        <w:t>)) que orquesta todos estos subsistemas por detrás, desacoplando la vista de la lógica de negocio profunda y mejorando la usabilidad del sistema.</w:t>
       </w:r>
     </w:p>
     <w:p>
@@ -2231,8 +2268,174 @@
         </w:drawing>
       </w:r>
     </w:p>
+    <w:p>
+      <w:pPr>
+        <w:rPr>
+          <w:b/>
+          <w:bCs/>
+        </w:rPr>
+      </w:pPr>
+      <w:r>
+        <w:rPr>
+          <w:b/>
+          <w:bCs/>
+        </w:rPr>
+        <w:lastRenderedPageBreak/>
+        <w:t>“nota de implementación del sistema”</w:t>
+      </w:r>
+    </w:p>
+    <w:p>
+      <w:pPr>
+        <w:rPr>
+          <w:b/>
+          <w:bCs/>
+        </w:rPr>
+      </w:pPr>
+      <w:r>
+        <w:rPr>
+          <w:b/>
+          <w:bCs/>
+        </w:rPr>
+        <w:t xml:space="preserve">Para demostrar la eficacia de los patrones sin generar código basura de interfaces gráficas, el sistema se ejecuta mediante un Script Automatizado en la clase Main.java. </w:t>
+      </w:r>
+    </w:p>
+    <w:p>
+      <w:pPr>
+        <w:rPr>
+          <w:b/>
+          <w:bCs/>
+        </w:rPr>
+      </w:pPr>
+      <w:r>
+        <w:rPr>
+          <w:b/>
+          <w:bCs/>
+        </w:rPr>
+        <w:t>Al ejecutarlo, la consola simula y testea exactamente los 3 flujos de nuestro diagrama BPMN (Reserva normal, Reserva rechazada y Anulación)."</w:t>
+      </w:r>
+    </w:p>
+    <w:p>
+      <w:pPr>
+        <w:rPr>
+          <w:b/>
+          <w:bCs/>
+        </w:rPr>
+      </w:pPr>
+    </w:p>
+    <w:p>
+      <w:pPr>
+        <w:rPr>
+          <w:b/>
+          <w:bCs/>
+        </w:rPr>
+      </w:pPr>
+    </w:p>
+    <w:p>
+      <w:pPr>
+        <w:rPr>
+          <w:b/>
+          <w:bCs/>
+        </w:rPr>
+      </w:pPr>
+      <w:r>
+        <w:rPr>
+          <w:b/>
+          <w:bCs/>
+        </w:rPr>
+        <w:t xml:space="preserve">ENLACE A REPERTORIO GIT: </w:t>
+      </w:r>
+      <w:hyperlink r:id="rId14" w:history="1">
+        <w:r>
+          <w:rPr>
+            <w:rStyle w:val="Hipervnculo"/>
+            <w:b/>
+            <w:bCs/>
+          </w:rPr>
+          <w:t>https://github.com/DiegoSL8/Sistema-de-reservas-para-hotel-.git</w:t>
+        </w:r>
+      </w:hyperlink>
+    </w:p>
+    <w:p>
+      <w:pPr>
+        <w:rPr>
+          <w:b/>
+          <w:bCs/>
+        </w:rPr>
+      </w:pPr>
+      <w:r>
+        <w:rPr>
+          <w:b/>
+          <w:bCs/>
+        </w:rPr>
+        <w:t xml:space="preserve">Respecto a los </w:t>
+      </w:r>
+      <w:proofErr w:type="spellStart"/>
+      <w:r>
+        <w:rPr>
+          <w:b/>
+          <w:bCs/>
+        </w:rPr>
+        <w:t>commits</w:t>
+      </w:r>
+      <w:proofErr w:type="spellEnd"/>
+      <w:r>
+        <w:rPr>
+          <w:b/>
+          <w:bCs/>
+        </w:rPr>
+        <w:t xml:space="preserve">, teníamos </w:t>
+      </w:r>
+      <w:proofErr w:type="spellStart"/>
+      <w:r>
+        <w:rPr>
+          <w:b/>
+          <w:bCs/>
+        </w:rPr>
+        <w:t>mas</w:t>
+      </w:r>
+      <w:proofErr w:type="spellEnd"/>
+      <w:r>
+        <w:rPr>
+          <w:b/>
+          <w:bCs/>
+        </w:rPr>
+        <w:t xml:space="preserve"> que detallaban el proceso de los diagramas y toma de requerimientos, pero al ocurrir un error en la subida de archivos e intento de solución de esta, coloque un forcé y termine perdiendo esos </w:t>
+      </w:r>
+      <w:proofErr w:type="spellStart"/>
+      <w:r>
+        <w:rPr>
+          <w:b/>
+          <w:bCs/>
+        </w:rPr>
+        <w:t>commits</w:t>
+      </w:r>
+      <w:proofErr w:type="spellEnd"/>
+      <w:r>
+        <w:rPr>
+          <w:b/>
+          <w:bCs/>
+        </w:rPr>
+        <w:t xml:space="preserve"> anteriores, pero se distribuyo de manera uniforme las tareas, trabajamos en </w:t>
+      </w:r>
+      <w:proofErr w:type="spellStart"/>
+      <w:r>
+        <w:rPr>
+          <w:b/>
+          <w:bCs/>
+        </w:rPr>
+        <w:t>sprints</w:t>
+      </w:r>
+      <w:proofErr w:type="spellEnd"/>
+      <w:r>
+        <w:rPr>
+          <w:b/>
+          <w:bCs/>
+        </w:rPr>
+        <w:t xml:space="preserve"> para ir avanzando de manera organizada y eficiente.</w:t>
+      </w:r>
+    </w:p>
     <w:sectPr>
-      <w:footerReference w:type="default" r:id="rId14"/>
+      <w:footerReference w:type="default" r:id="rId15"/>
       <w:pgSz w:w="12240" w:h="15840"/>
       <w:pgMar w:top="1417" w:right="1701" w:bottom="1417" w:left="1701" w:header="708" w:footer="708" w:gutter="0"/>
       <w:pgNumType w:start="1"/>

</xml_diff>